<commit_message>
docs: update official submission report for current prototype
</commit_message>
<xml_diff>
--- a/output/docx/会脉—官方模板作品方案.docx
+++ b/output/docx/会脉—官方模板作品方案.docx
@@ -12,7 +12,7 @@
       </w:pPr>
       <w:r>
         <w:rPr>
-          <w:rFonts w:ascii="宋体" w:hAnsi="宋体" w:eastAsia="宋体"/>
+          <w:rFonts w:ascii="Arial Unicode MS" w:hAnsi="Arial Unicode MS" w:eastAsia="Arial Unicode MS" w:cs="Arial Unicode MS"/>
           <w:b/>
           <w:color w:val="000000"/>
           <w:sz w:val="44"/>
@@ -27,7 +27,7 @@
       </w:pPr>
       <w:r>
         <w:rPr>
-          <w:rFonts w:ascii="宋体" w:hAnsi="宋体" w:eastAsia="宋体"/>
+          <w:rFonts w:ascii="Arial Unicode MS" w:hAnsi="Arial Unicode MS" w:eastAsia="Arial Unicode MS" w:cs="Arial Unicode MS"/>
           <w:b/>
           <w:color w:val="000000"/>
           <w:sz w:val="44"/>
@@ -42,7 +42,7 @@
       </w:pPr>
       <w:r>
         <w:rPr>
-          <w:rFonts w:ascii="宋体" w:hAnsi="宋体" w:eastAsia="宋体"/>
+          <w:rFonts w:ascii="Arial Unicode MS" w:hAnsi="Arial Unicode MS" w:eastAsia="Arial Unicode MS" w:cs="Arial Unicode MS"/>
           <w:b/>
           <w:color w:val="000000"/>
           <w:sz w:val="38"/>
@@ -57,7 +57,7 @@
       </w:pPr>
       <w:r>
         <w:rPr>
-          <w:rFonts w:ascii="宋体" w:hAnsi="宋体" w:eastAsia="宋体"/>
+          <w:rFonts w:ascii="Arial Unicode MS" w:hAnsi="Arial Unicode MS" w:eastAsia="Arial Unicode MS" w:cs="Arial Unicode MS"/>
           <w:color w:val="000000"/>
           <w:sz w:val="30"/>
         </w:rPr>
@@ -71,7 +71,7 @@
       </w:pPr>
       <w:r>
         <w:rPr>
-          <w:rFonts w:ascii="宋体" w:hAnsi="宋体" w:eastAsia="宋体"/>
+          <w:rFonts w:ascii="Arial Unicode MS" w:hAnsi="Arial Unicode MS" w:eastAsia="Arial Unicode MS" w:cs="Arial Unicode MS"/>
           <w:b/>
           <w:color w:val="000000"/>
           <w:sz w:val="44"/>
@@ -86,7 +86,7 @@
       </w:pPr>
       <w:r>
         <w:rPr>
-          <w:rFonts w:ascii="宋体" w:hAnsi="宋体" w:eastAsia="宋体"/>
+          <w:rFonts w:ascii="Arial Unicode MS" w:hAnsi="Arial Unicode MS" w:eastAsia="Arial Unicode MS" w:cs="Arial Unicode MS"/>
           <w:b/>
           <w:color w:val="000000"/>
           <w:sz w:val="36"/>
@@ -101,7 +101,7 @@
       </w:pPr>
       <w:r>
         <w:rPr>
-          <w:rFonts w:ascii="宋体" w:hAnsi="宋体" w:eastAsia="宋体"/>
+          <w:rFonts w:ascii="Arial Unicode MS" w:hAnsi="Arial Unicode MS" w:eastAsia="Arial Unicode MS" w:cs="Arial Unicode MS"/>
           <w:color w:val="000000"/>
           <w:sz w:val="24"/>
         </w:rPr>
@@ -115,7 +115,7 @@
       </w:pPr>
       <w:r>
         <w:rPr>
-          <w:rFonts w:ascii="宋体" w:hAnsi="宋体" w:eastAsia="宋体"/>
+          <w:rFonts w:ascii="Arial Unicode MS" w:hAnsi="Arial Unicode MS" w:eastAsia="Arial Unicode MS" w:cs="Arial Unicode MS"/>
           <w:color w:val="000000"/>
           <w:sz w:val="24"/>
         </w:rPr>
@@ -129,7 +129,7 @@
       </w:pPr>
       <w:r>
         <w:rPr>
-          <w:rFonts w:ascii="宋体" w:hAnsi="宋体" w:eastAsia="宋体"/>
+          <w:rFonts w:ascii="Arial Unicode MS" w:hAnsi="Arial Unicode MS" w:eastAsia="Arial Unicode MS" w:cs="Arial Unicode MS"/>
           <w:color w:val="000000"/>
           <w:sz w:val="24"/>
         </w:rPr>
@@ -141,7 +141,7 @@
     <w:p>
       <w:r>
         <w:rPr>
-          <w:rFonts w:ascii="宋体" w:hAnsi="宋体" w:eastAsia="宋体"/>
+          <w:rFonts w:ascii="Arial Unicode MS" w:hAnsi="Arial Unicode MS" w:eastAsia="Arial Unicode MS" w:cs="Arial Unicode MS"/>
         </w:rPr>
         <w:br w:type="page"/>
       </w:r>
@@ -153,7 +153,7 @@
       </w:pPr>
       <w:r>
         <w:rPr>
-          <w:rFonts w:ascii="宋体" w:hAnsi="宋体" w:eastAsia="宋体"/>
+          <w:rFonts w:ascii="Arial Unicode MS" w:hAnsi="Arial Unicode MS" w:eastAsia="Arial Unicode MS" w:cs="Arial Unicode MS"/>
           <w:b/>
           <w:color w:val="000000"/>
           <w:sz w:val="44"/>
@@ -171,7 +171,7 @@
       </w:pPr>
       <w:r>
         <w:rPr>
-          <w:rFonts w:ascii="宋体" w:hAnsi="宋体" w:eastAsia="宋体"/>
+          <w:rFonts w:ascii="Arial Unicode MS" w:hAnsi="Arial Unicode MS" w:eastAsia="Arial Unicode MS" w:cs="Arial Unicode MS"/>
         </w:rPr>
         <w:t>作品简介</w:t>
       </w:r>
@@ -186,7 +186,7 @@
       </w:pPr>
       <w:r>
         <w:rPr>
-          <w:rFonts w:ascii="宋体" w:hAnsi="宋体" w:eastAsia="宋体"/>
+          <w:rFonts w:ascii="Arial Unicode MS" w:hAnsi="Arial Unicode MS" w:eastAsia="Arial Unicode MS" w:cs="Arial Unicode MS"/>
         </w:rPr>
         <w:t>一、项目概述</w:t>
       </w:r>
@@ -201,7 +201,7 @@
       </w:pPr>
       <w:r>
         <w:rPr>
-          <w:rFonts w:ascii="宋体" w:hAnsi="宋体" w:eastAsia="宋体"/>
+          <w:rFonts w:ascii="Arial Unicode MS" w:hAnsi="Arial Unicode MS" w:eastAsia="Arial Unicode MS" w:cs="Arial Unicode MS"/>
         </w:rPr>
         <w:t>（一）项目背景与意义</w:t>
       </w:r>
@@ -216,7 +216,7 @@
       </w:pPr>
       <w:r>
         <w:rPr>
-          <w:rFonts w:ascii="宋体" w:hAnsi="宋体" w:eastAsia="宋体"/>
+          <w:rFonts w:ascii="Arial Unicode MS" w:hAnsi="Arial Unicode MS" w:eastAsia="Arial Unicode MS" w:cs="Arial Unicode MS"/>
         </w:rPr>
         <w:t>（二）赛题方向定位</w:t>
       </w:r>
@@ -231,7 +231,7 @@
       </w:pPr>
       <w:r>
         <w:rPr>
-          <w:rFonts w:ascii="宋体" w:hAnsi="宋体" w:eastAsia="宋体"/>
+          <w:rFonts w:ascii="Arial Unicode MS" w:hAnsi="Arial Unicode MS" w:eastAsia="Arial Unicode MS" w:cs="Arial Unicode MS"/>
         </w:rPr>
         <w:t>二、核心技术方案与创新设计</w:t>
       </w:r>
@@ -246,16 +246,18 @@
       </w:pPr>
       <w:r>
         <w:rPr>
-          <w:rFonts w:ascii="宋体" w:hAnsi="宋体" w:eastAsia="宋体"/>
+          <w:rFonts w:ascii="Arial Unicode MS" w:hAnsi="Arial Unicode MS" w:eastAsia="Arial Unicode MS" w:cs="Arial Unicode MS"/>
         </w:rPr>
         <w:t>（一）总体架构与工作流程</w:t>
       </w:r>
     </w:p>
     <w:p>
-      <w:pPr/>
+      <w:pPr>
+        <w:pageBreakBefore w:val="0"/>
+      </w:pPr>
       <w:r>
         <w:rPr>
-          <w:rFonts w:ascii="宋体" w:hAnsi="宋体" w:eastAsia="宋体"/>
+          <w:rFonts w:ascii="Arial Unicode MS" w:hAnsi="Arial Unicode MS" w:eastAsia="Arial Unicode MS" w:cs="Arial Unicode MS"/>
         </w:rPr>
         <w:t>（二）核心算法：双智能体增量建图</w:t>
       </w:r>
@@ -271,7 +273,7 @@
       </w:pPr>
       <w:r>
         <w:rPr>
-          <w:rFonts w:ascii="宋体" w:hAnsi="宋体" w:eastAsia="宋体"/>
+          <w:rFonts w:ascii="Arial Unicode MS" w:hAnsi="Arial Unicode MS" w:eastAsia="Arial Unicode MS" w:cs="Arial Unicode MS"/>
         </w:rPr>
         <w:t>（三）关键创新点</w:t>
       </w:r>
@@ -286,7 +288,7 @@
       </w:pPr>
       <w:r>
         <w:rPr>
-          <w:rFonts w:ascii="宋体" w:hAnsi="宋体" w:eastAsia="宋体"/>
+          <w:rFonts w:ascii="Arial Unicode MS" w:hAnsi="Arial Unicode MS" w:eastAsia="Arial Unicode MS" w:cs="Arial Unicode MS"/>
         </w:rPr>
         <w:t>（四）系统实现与功能呈现</w:t>
       </w:r>
@@ -301,7 +303,7 @@
       </w:pPr>
       <w:r>
         <w:rPr>
-          <w:rFonts w:ascii="宋体" w:hAnsi="宋体" w:eastAsia="宋体"/>
+          <w:rFonts w:ascii="Arial Unicode MS" w:hAnsi="Arial Unicode MS" w:eastAsia="Arial Unicode MS" w:cs="Arial Unicode MS"/>
         </w:rPr>
         <w:t>（五）应用场景与效果评估</w:t>
       </w:r>
@@ -316,9 +318,33 @@
       </w:pPr>
       <w:r>
         <w:rPr>
-          <w:rFonts w:ascii="宋体" w:hAnsi="宋体" w:eastAsia="宋体"/>
+          <w:rFonts w:ascii="Arial Unicode MS" w:hAnsi="Arial Unicode MS" w:eastAsia="Arial Unicode MS" w:cs="Arial Unicode MS"/>
         </w:rPr>
         <w:t>（六）数据安全与部署方式</w:t>
+      </w:r>
+    </w:p>
+    <w:p>
+      <w:r>
+        <w:rPr>
+          <w:rFonts w:ascii="Arial Unicode MS" w:hAnsi="Arial Unicode MS" w:eastAsia="Arial Unicode MS" w:cs="Arial Unicode MS"/>
+        </w:rPr>
+        <w:t>三、开发测试与实测结果</w:t>
+      </w:r>
+    </w:p>
+    <w:p>
+      <w:r>
+        <w:rPr>
+          <w:rFonts w:ascii="Arial Unicode MS" w:hAnsi="Arial Unicode MS" w:eastAsia="Arial Unicode MS" w:cs="Arial Unicode MS"/>
+        </w:rPr>
+        <w:t>四、本机部署与演示</w:t>
+      </w:r>
+    </w:p>
+    <w:p>
+      <w:r>
+        <w:rPr>
+          <w:rFonts w:ascii="Arial Unicode MS" w:hAnsi="Arial Unicode MS" w:eastAsia="Arial Unicode MS" w:cs="Arial Unicode MS"/>
+        </w:rPr>
+        <w:t>五、应用价值、局限与后续计划</w:t>
       </w:r>
     </w:p>
     <w:p>
@@ -331,15 +357,15 @@
       </w:pPr>
       <w:r>
         <w:rPr>
-          <w:rFonts w:ascii="宋体" w:hAnsi="宋体" w:eastAsia="宋体"/>
+          <w:rFonts w:ascii="Arial Unicode MS" w:hAnsi="Arial Unicode MS" w:eastAsia="Arial Unicode MS" w:cs="Arial Unicode MS"/>
         </w:rPr>
-        <w:t>三、附录</w:t>
+        <w:t>六、附录</w:t>
       </w:r>
     </w:p>
     <w:p>
       <w:r>
         <w:rPr>
-          <w:rFonts w:ascii="宋体" w:hAnsi="宋体" w:eastAsia="宋体"/>
+          <w:rFonts w:ascii="Arial Unicode MS" w:hAnsi="Arial Unicode MS" w:eastAsia="Arial Unicode MS" w:cs="Arial Unicode MS"/>
         </w:rPr>
         <w:br w:type="page"/>
       </w:r>
@@ -352,7 +378,7 @@
       </w:pPr>
       <w:r>
         <w:rPr>
-          <w:rFonts w:ascii="宋体" w:hAnsi="宋体" w:eastAsia="宋体"/>
+          <w:rFonts w:ascii="Arial Unicode MS" w:hAnsi="Arial Unicode MS" w:eastAsia="Arial Unicode MS" w:cs="Arial Unicode MS"/>
           <w:b/>
           <w:color w:val="000000"/>
           <w:sz w:val="32"/>
@@ -367,9 +393,9 @@
       </w:pPr>
       <w:r>
         <w:rPr>
-          <w:rFonts w:ascii="宋体" w:hAnsi="宋体" w:eastAsia="宋体"/>
+          <w:rFonts w:ascii="Arial Unicode MS" w:hAnsi="Arial Unicode MS" w:eastAsia="Arial Unicode MS" w:cs="Arial Unicode MS"/>
         </w:rPr>
-        <w:t>会脉面向讨论密集、结论分散的会议场景，构建从语音或文本发言到可追溯会议脉络图的智能体系统。分析智能体提取议题、观点、证据、结论、行动与分歧，图同步智能体将语义变化转化为增量图操作；双存储结构把每个关键节点关联回原始发言。系统提供实时脉络看板、关系浏览、人工修订和结构化纪要导出，适用于项目讨论、课程研讨、产品评审与团队复盘。</w:t>
+        <w:t>会脉是一套本机运行的会议决策工作台。用户在会前导入议程和材料，确认待决问题；会中从发言图谱查看支持、反对与来源，人工审核决策；会后维护负责人、期限和状态；下一场会议可由主持人手动关联议题，回看旧决议、新证据与未完成行动。双智能体负责候选分析和增量建图，人负责最终确认。当前交付为本机演示版本，真实模型抽取质量尚未达到目标，真实麦克风及用户试用仍待验收。</w:t>
       </w:r>
     </w:p>
     <w:p>
@@ -380,7 +406,7 @@
       </w:pPr>
       <w:r>
         <w:rPr>
-          <w:rFonts w:ascii="宋体" w:hAnsi="宋体" w:eastAsia="宋体"/>
+          <w:rFonts w:ascii="Arial Unicode MS" w:hAnsi="Arial Unicode MS" w:eastAsia="Arial Unicode MS" w:cs="Arial Unicode MS"/>
           <w:b/>
           <w:color w:val="000000"/>
           <w:sz w:val="32"/>
@@ -396,7 +422,7 @@
       </w:pPr>
       <w:r>
         <w:rPr>
-          <w:rFonts w:ascii="宋体" w:hAnsi="宋体" w:eastAsia="宋体"/>
+          <w:rFonts w:ascii="Arial Unicode MS" w:hAnsi="Arial Unicode MS" w:eastAsia="Arial Unicode MS" w:cs="Arial Unicode MS"/>
           <w:b/>
           <w:color w:val="000000"/>
           <w:sz w:val="28"/>
@@ -411,7 +437,7 @@
       </w:pPr>
       <w:r>
         <w:rPr>
-          <w:rFonts w:ascii="宋体" w:hAnsi="宋体" w:eastAsia="宋体"/>
+          <w:rFonts w:ascii="Arial Unicode MS" w:hAnsi="Arial Unicode MS" w:eastAsia="Arial Unicode MS" w:cs="Arial Unicode MS"/>
           <w:color w:val="000000"/>
           <w:sz w:val="24"/>
         </w:rPr>
@@ -425,7 +451,7 @@
       </w:pPr>
       <w:r>
         <w:rPr>
-          <w:rFonts w:ascii="宋体" w:hAnsi="宋体" w:eastAsia="宋体"/>
+          <w:rFonts w:ascii="Arial Unicode MS" w:hAnsi="Arial Unicode MS" w:eastAsia="Arial Unicode MS" w:cs="Arial Unicode MS"/>
           <w:color w:val="000000"/>
           <w:sz w:val="24"/>
         </w:rPr>
@@ -440,7 +466,7 @@
       </w:pPr>
       <w:r>
         <w:rPr>
-          <w:rFonts w:ascii="宋体" w:hAnsi="宋体" w:eastAsia="宋体"/>
+          <w:rFonts w:ascii="Arial Unicode MS" w:hAnsi="Arial Unicode MS" w:eastAsia="Arial Unicode MS" w:cs="Arial Unicode MS"/>
           <w:b/>
           <w:color w:val="000000"/>
           <w:sz w:val="28"/>
@@ -455,7 +481,7 @@
       </w:pPr>
       <w:r>
         <w:rPr>
-          <w:rFonts w:ascii="宋体" w:hAnsi="宋体" w:eastAsia="宋体"/>
+          <w:rFonts w:ascii="Arial Unicode MS" w:hAnsi="Arial Unicode MS" w:eastAsia="Arial Unicode MS" w:cs="Arial Unicode MS"/>
           <w:color w:val="000000"/>
           <w:sz w:val="24"/>
         </w:rPr>
@@ -470,7 +496,7 @@
       </w:pPr>
       <w:r>
         <w:rPr>
-          <w:rFonts w:ascii="宋体" w:hAnsi="宋体" w:eastAsia="宋体"/>
+          <w:rFonts w:ascii="Arial Unicode MS" w:hAnsi="Arial Unicode MS" w:eastAsia="Arial Unicode MS" w:cs="Arial Unicode MS"/>
           <w:b/>
           <w:color w:val="000000"/>
           <w:sz w:val="32"/>
@@ -486,7 +512,7 @@
       </w:pPr>
       <w:r>
         <w:rPr>
-          <w:rFonts w:ascii="宋体" w:hAnsi="宋体" w:eastAsia="宋体"/>
+          <w:rFonts w:ascii="Arial Unicode MS" w:hAnsi="Arial Unicode MS" w:eastAsia="Arial Unicode MS" w:cs="Arial Unicode MS"/>
           <w:b/>
           <w:color w:val="000000"/>
           <w:sz w:val="28"/>
@@ -501,7 +527,7 @@
       </w:pPr>
       <w:r>
         <w:rPr>
-          <w:rFonts w:ascii="宋体" w:hAnsi="宋体" w:eastAsia="宋体"/>
+          <w:rFonts w:ascii="Arial Unicode MS" w:hAnsi="Arial Unicode MS" w:eastAsia="Arial Unicode MS" w:cs="Arial Unicode MS"/>
           <w:color w:val="000000"/>
           <w:sz w:val="24"/>
         </w:rPr>
@@ -549,7 +575,7 @@
             </w:pPr>
             <w:r>
               <w:rPr>
-                <w:rFonts w:ascii="宋体" w:hAnsi="宋体" w:eastAsia="宋体"/>
+                <w:rFonts w:ascii="Arial Unicode MS" w:hAnsi="Arial Unicode MS" w:eastAsia="Arial Unicode MS" w:cs="Arial Unicode MS"/>
                 <w:b/>
                 <w:color w:val="000000"/>
                 <w:sz w:val="21"/>
@@ -576,7 +602,7 @@
             </w:pPr>
             <w:r>
               <w:rPr>
-                <w:rFonts w:ascii="宋体" w:hAnsi="宋体" w:eastAsia="宋体"/>
+                <w:rFonts w:ascii="Arial Unicode MS" w:hAnsi="Arial Unicode MS" w:eastAsia="Arial Unicode MS" w:cs="Arial Unicode MS"/>
                 <w:b/>
                 <w:color w:val="000000"/>
                 <w:sz w:val="21"/>
@@ -603,7 +629,7 @@
             </w:pPr>
             <w:r>
               <w:rPr>
-                <w:rFonts w:ascii="宋体" w:hAnsi="宋体" w:eastAsia="宋体"/>
+                <w:rFonts w:ascii="Arial Unicode MS" w:hAnsi="Arial Unicode MS" w:eastAsia="Arial Unicode MS" w:cs="Arial Unicode MS"/>
                 <w:b/>
                 <w:color w:val="000000"/>
                 <w:sz w:val="21"/>
@@ -630,7 +656,7 @@
             </w:pPr>
             <w:r>
               <w:rPr>
-                <w:rFonts w:ascii="宋体" w:hAnsi="宋体" w:eastAsia="宋体"/>
+                <w:rFonts w:ascii="Arial Unicode MS" w:hAnsi="Arial Unicode MS" w:eastAsia="Arial Unicode MS" w:cs="Arial Unicode MS"/>
                 <w:b/>
                 <w:color w:val="000000"/>
                 <w:sz w:val="21"/>
@@ -657,7 +683,7 @@
             </w:pPr>
             <w:r>
               <w:rPr>
-                <w:rFonts w:ascii="宋体" w:hAnsi="宋体" w:eastAsia="宋体"/>
+                <w:rFonts w:ascii="Arial Unicode MS" w:hAnsi="Arial Unicode MS" w:eastAsia="Arial Unicode MS" w:cs="Arial Unicode MS"/>
                 <w:b/>
                 <w:color w:val="000000"/>
                 <w:sz w:val="21"/>
@@ -685,7 +711,7 @@
             </w:pPr>
             <w:r>
               <w:rPr>
-                <w:rFonts w:ascii="宋体" w:hAnsi="宋体" w:eastAsia="宋体"/>
+                <w:rFonts w:ascii="Arial Unicode MS" w:hAnsi="Arial Unicode MS" w:eastAsia="Arial Unicode MS" w:cs="Arial Unicode MS"/>
                 <w:color w:val="000000"/>
                 <w:sz w:val="19"/>
               </w:rPr>
@@ -710,7 +736,7 @@
             </w:pPr>
             <w:r>
               <w:rPr>
-                <w:rFonts w:ascii="宋体" w:hAnsi="宋体" w:eastAsia="宋体"/>
+                <w:rFonts w:ascii="Arial Unicode MS" w:hAnsi="Arial Unicode MS" w:eastAsia="Arial Unicode MS" w:cs="Arial Unicode MS"/>
                 <w:color w:val="000000"/>
                 <w:sz w:val="19"/>
               </w:rPr>
@@ -737,7 +763,7 @@
             </w:pPr>
             <w:r>
               <w:rPr>
-                <w:rFonts w:ascii="宋体" w:hAnsi="宋体" w:eastAsia="宋体"/>
+                <w:rFonts w:ascii="Arial Unicode MS" w:hAnsi="Arial Unicode MS" w:eastAsia="Arial Unicode MS" w:cs="Arial Unicode MS"/>
                 <w:color w:val="000000"/>
                 <w:sz w:val="19"/>
               </w:rPr>
@@ -764,7 +790,7 @@
             </w:pPr>
             <w:r>
               <w:rPr>
-                <w:rFonts w:ascii="宋体" w:hAnsi="宋体" w:eastAsia="宋体"/>
+                <w:rFonts w:ascii="Arial Unicode MS" w:hAnsi="Arial Unicode MS" w:eastAsia="Arial Unicode MS" w:cs="Arial Unicode MS"/>
                 <w:color w:val="000000"/>
                 <w:sz w:val="19"/>
               </w:rPr>
@@ -792,7 +818,7 @@
             </w:pPr>
             <w:r>
               <w:rPr>
-                <w:rFonts w:ascii="宋体" w:hAnsi="宋体" w:eastAsia="宋体"/>
+                <w:rFonts w:ascii="Arial Unicode MS" w:hAnsi="Arial Unicode MS" w:eastAsia="Arial Unicode MS" w:cs="Arial Unicode MS"/>
                 <w:color w:val="000000"/>
                 <w:sz w:val="19"/>
               </w:rPr>
@@ -811,7 +837,7 @@
       </w:pPr>
       <w:r>
         <w:rPr>
-          <w:rFonts w:ascii="宋体" w:hAnsi="宋体" w:eastAsia="宋体"/>
+          <w:rFonts w:ascii="Arial Unicode MS" w:hAnsi="Arial Unicode MS" w:eastAsia="Arial Unicode MS" w:cs="Arial Unicode MS"/>
           <w:b/>
           <w:color w:val="000000"/>
           <w:sz w:val="20"/>
@@ -823,7 +849,7 @@
       <w:pPr>
         <w:pStyle w:val="Heading2"/>
         <w:keepNext/>
-        <w:pageBreakBefore/>
+        <w:pageBreakBefore w:val="0"/>
         <w:tabs>
           <w:tab w:pos="8164" w:val="left"/>
         </w:tabs>
@@ -832,7 +858,7 @@
       </w:pPr>
       <w:r>
         <w:rPr>
-          <w:rFonts w:ascii="宋体" w:hAnsi="宋体" w:eastAsia="宋体"/>
+          <w:rFonts w:ascii="Arial Unicode MS" w:hAnsi="Arial Unicode MS" w:eastAsia="Arial Unicode MS" w:cs="Arial Unicode MS"/>
         </w:rPr>
         <w:t>（二）核心算法：双智能体驱动的增量会议脉络构建</w:t>
       </w:r>
@@ -843,7 +869,7 @@
       </w:pPr>
       <w:r>
         <w:rPr>
-          <w:rFonts w:ascii="宋体" w:hAnsi="宋体" w:eastAsia="宋体"/>
+          <w:rFonts w:ascii="Arial Unicode MS" w:hAnsi="Arial Unicode MS" w:eastAsia="Arial Unicode MS" w:cs="Arial Unicode MS"/>
         </w:rPr>
         <w:t>算法将“理解发言”和“修改图谱”分离：前者提炼会议语义，后者依据当前图状态规划最小增量更新。结构化交接、操作校验和来源引用共同保证脉络可演化、可解释、可人工修订。</w:t>
       </w:r>
@@ -855,7 +881,7 @@
       </w:pPr>
       <w:r>
         <w:rPr>
-          <w:rFonts w:ascii="宋体" w:hAnsi="宋体" w:eastAsia="宋体"/>
+          <w:rFonts w:ascii="Arial Unicode MS" w:hAnsi="Arial Unicode MS" w:eastAsia="Arial Unicode MS" w:cs="Arial Unicode MS"/>
         </w:rPr>
         <w:drawing>
           <wp:inline xmlns:a="http://schemas.openxmlformats.org/drawingml/2006/main" xmlns:pic="http://schemas.openxmlformats.org/drawingml/2006/picture">
@@ -898,7 +924,7 @@
       </w:pPr>
       <w:r>
         <w:rPr>
-          <w:rFonts w:ascii="宋体" w:hAnsi="宋体" w:eastAsia="宋体"/>
+          <w:rFonts w:ascii="Arial Unicode MS" w:hAnsi="Arial Unicode MS" w:eastAsia="Arial Unicode MS" w:cs="Arial Unicode MS"/>
         </w:rPr>
         <w:t>图2  双智能体增量建图与证据回溯算法链路</w:t>
       </w:r>
@@ -909,7 +935,7 @@
       </w:pPr>
       <w:r>
         <w:rPr>
-          <w:rFonts w:ascii="宋体" w:hAnsi="宋体" w:eastAsia="宋体"/>
+          <w:rFonts w:ascii="Arial Unicode MS" w:hAnsi="Arial Unicode MS" w:eastAsia="Arial Unicode MS" w:cs="Arial Unicode MS"/>
           <w:b/>
           <w:sz w:val="17"/>
         </w:rPr>
@@ -917,7 +943,7 @@
       </w:r>
       <w:r>
         <w:rPr>
-          <w:rFonts w:ascii="宋体" w:hAnsi="宋体" w:eastAsia="宋体"/>
+          <w:rFonts w:ascii="Arial Unicode MS" w:hAnsi="Arial Unicode MS" w:eastAsia="Arial Unicode MS" w:cs="Arial Unicode MS"/>
           <w:sz w:val="17"/>
         </w:rPr>
         <w:t>本地语音识别结果与手动文本统一为 NormUtterance，保存发言内容、来源、会话与顺序标识；空文本、重复事件和无效会话在进入语义分析前过滤。</w:t>
@@ -929,7 +955,7 @@
       </w:pPr>
       <w:r>
         <w:rPr>
-          <w:rFonts w:ascii="宋体" w:hAnsi="宋体" w:eastAsia="宋体"/>
+          <w:rFonts w:ascii="Arial Unicode MS" w:hAnsi="Arial Unicode MS" w:eastAsia="Arial Unicode MS" w:cs="Arial Unicode MS"/>
           <w:b/>
           <w:sz w:val="17"/>
         </w:rPr>
@@ -937,7 +963,7 @@
       </w:r>
       <w:r>
         <w:rPr>
-          <w:rFonts w:ascii="宋体" w:hAnsi="宋体" w:eastAsia="宋体"/>
+          <w:rFonts w:ascii="Arial Unicode MS" w:hAnsi="Arial Unicode MS" w:eastAsia="Arial Unicode MS" w:cs="Arial Unicode MS"/>
           <w:sz w:val="17"/>
         </w:rPr>
         <w:t>Analyzer Agent 从发言与会议上下文中抽取议题、观点、论据、结论、行动项及分歧，组织为 MeetingSummary；每项语义保留指向发言来源的引用。</w:t>
@@ -949,7 +975,7 @@
       </w:pPr>
       <w:r>
         <w:rPr>
-          <w:rFonts w:ascii="宋体" w:hAnsi="宋体" w:eastAsia="宋体"/>
+          <w:rFonts w:ascii="Arial Unicode MS" w:hAnsi="Arial Unicode MS" w:eastAsia="Arial Unicode MS" w:cs="Arial Unicode MS"/>
           <w:b/>
           <w:sz w:val="17"/>
         </w:rPr>
@@ -957,7 +983,7 @@
       </w:r>
       <w:r>
         <w:rPr>
-          <w:rFonts w:ascii="宋体" w:hAnsi="宋体" w:eastAsia="宋体"/>
+          <w:rFonts w:ascii="Arial Unicode MS" w:hAnsi="Arial Unicode MS" w:eastAsia="Arial Unicode MS" w:cs="Arial Unicode MS"/>
           <w:sz w:val="17"/>
         </w:rPr>
         <w:t>Syncer Agent 对照当前 Store A 图状态，完成节点对齐、关系判定与冲突处理，生成新增、更新、关联、重复或替代等 GraphUpdateOp；操作经结构校验后应用到图谱。</w:t>
@@ -969,7 +995,7 @@
       </w:pPr>
       <w:r>
         <w:rPr>
-          <w:rFonts w:ascii="宋体" w:hAnsi="宋体" w:eastAsia="宋体"/>
+          <w:rFonts w:ascii="Arial Unicode MS" w:hAnsi="Arial Unicode MS" w:eastAsia="Arial Unicode MS" w:cs="Arial Unicode MS"/>
           <w:b/>
           <w:sz w:val="17"/>
         </w:rPr>
@@ -977,7 +1003,7 @@
       </w:r>
       <w:r>
         <w:rPr>
-          <w:rFonts w:ascii="宋体" w:hAnsi="宋体" w:eastAsia="宋体"/>
+          <w:rFonts w:ascii="Arial Unicode MS" w:hAnsi="Arial Unicode MS" w:eastAsia="Arial Unicode MS" w:cs="Arial Unicode MS"/>
           <w:sz w:val="17"/>
         </w:rPr>
         <w:t>Store A 维护可视化关系图，Store B 保存原始发言与元数据；metadata_refs 建立“结论—依据—原话”回溯链。人工编辑及锁定状态进入同步约束，避免自动更新覆盖人工确认内容。</w:t>
@@ -989,7 +1015,7 @@
       </w:pPr>
       <w:r>
         <w:rPr>
-          <w:rFonts w:ascii="宋体" w:hAnsi="宋体" w:eastAsia="宋体"/>
+          <w:rFonts w:ascii="Arial Unicode MS" w:hAnsi="Arial Unicode MS" w:eastAsia="Arial Unicode MS" w:cs="Arial Unicode MS"/>
           <w:b/>
           <w:sz w:val="17"/>
         </w:rPr>
@@ -997,7 +1023,7 @@
       </w:r>
       <w:r>
         <w:rPr>
-          <w:rFonts w:ascii="宋体" w:hAnsi="宋体" w:eastAsia="宋体"/>
+          <w:rFonts w:ascii="Arial Unicode MS" w:hAnsi="Arial Unicode MS" w:eastAsia="Arial Unicode MS" w:cs="Arial Unicode MS"/>
           <w:sz w:val="17"/>
         </w:rPr>
         <w:t>设当前图为 Gₜ₋₁，新发言为 uₜ；先计算 Mₜ=Analyzer(uₜ, 上下文)，再由 Syncer(Mₜ, Gₜ₋₁) 生成操作集 Oₜ，最后执行 Gₜ=Apply(Validate(Oₜ), Gₜ₋₁)。人工锁定节点与来源引用作为操作约束参与校验。</w:t>
@@ -1009,7 +1035,7 @@
       </w:pPr>
       <w:r>
         <w:rPr>
-          <w:rFonts w:ascii="宋体" w:hAnsi="宋体" w:eastAsia="宋体"/>
+          <w:rFonts w:ascii="Arial Unicode MS" w:hAnsi="Arial Unicode MS" w:eastAsia="Arial Unicode MS" w:cs="Arial Unicode MS"/>
           <w:sz w:val="17"/>
         </w:rPr>
         <w:t>算法输出不是一次性摘要，而是随发言持续更新的带证据关系图；支持、反对、重复与替代等关系把观点演化显式呈现，为现场共识追踪和会后复盘提供同一数据基础。</w:t>
@@ -1024,7 +1050,7 @@
       </w:pPr>
       <w:r>
         <w:rPr>
-          <w:rFonts w:ascii="宋体" w:hAnsi="宋体" w:eastAsia="宋体"/>
+          <w:rFonts w:ascii="Arial Unicode MS" w:hAnsi="Arial Unicode MS" w:eastAsia="Arial Unicode MS" w:cs="Arial Unicode MS"/>
           <w:b/>
           <w:color w:val="000000"/>
           <w:sz w:val="28"/>
@@ -1039,7 +1065,7 @@
       </w:pPr>
       <w:r>
         <w:rPr>
-          <w:rFonts w:ascii="宋体" w:hAnsi="宋体" w:eastAsia="宋体"/>
+          <w:rFonts w:ascii="Arial Unicode MS" w:hAnsi="Arial Unicode MS" w:eastAsia="Arial Unicode MS" w:cs="Arial Unicode MS"/>
           <w:color w:val="000000"/>
           <w:sz w:val="23"/>
         </w:rPr>
@@ -1053,7 +1079,7 @@
       </w:pPr>
       <w:r>
         <w:rPr>
-          <w:rFonts w:ascii="宋体" w:hAnsi="宋体" w:eastAsia="宋体"/>
+          <w:rFonts w:ascii="Arial Unicode MS" w:hAnsi="Arial Unicode MS" w:eastAsia="Arial Unicode MS" w:cs="Arial Unicode MS"/>
           <w:color w:val="000000"/>
           <w:sz w:val="23"/>
         </w:rPr>
@@ -1067,7 +1093,7 @@
       </w:pPr>
       <w:r>
         <w:rPr>
-          <w:rFonts w:ascii="宋体" w:hAnsi="宋体" w:eastAsia="宋体"/>
+          <w:rFonts w:ascii="Arial Unicode MS" w:hAnsi="Arial Unicode MS" w:eastAsia="Arial Unicode MS" w:cs="Arial Unicode MS"/>
           <w:color w:val="000000"/>
           <w:sz w:val="23"/>
         </w:rPr>
@@ -1081,7 +1107,7 @@
       </w:pPr>
       <w:r>
         <w:rPr>
-          <w:rFonts w:ascii="宋体" w:hAnsi="宋体" w:eastAsia="宋体"/>
+          <w:rFonts w:ascii="Arial Unicode MS" w:hAnsi="Arial Unicode MS" w:eastAsia="Arial Unicode MS" w:cs="Arial Unicode MS"/>
           <w:color w:val="000000"/>
           <w:sz w:val="23"/>
         </w:rPr>
@@ -1096,7 +1122,7 @@
       </w:pPr>
       <w:r>
         <w:rPr>
-          <w:rFonts w:ascii="宋体" w:hAnsi="宋体" w:eastAsia="宋体"/>
+          <w:rFonts w:ascii="Arial Unicode MS" w:hAnsi="Arial Unicode MS" w:eastAsia="Arial Unicode MS" w:cs="Arial Unicode MS"/>
         </w:rPr>
         <w:t>（四）系统实现与功能呈现</w:t>
       </w:r>
@@ -1108,9 +1134,9 @@
       </w:pPr>
       <w:r>
         <w:rPr>
-          <w:rFonts w:ascii="宋体" w:hAnsi="宋体" w:eastAsia="宋体"/>
+          <w:rFonts w:ascii="Arial Unicode MS" w:hAnsi="Arial Unicode MS" w:eastAsia="Arial Unicode MS" w:cs="Arial Unicode MS"/>
         </w:rPr>
-        <w:t>系统由会议工作台、统一发言事件、双智能体编排、Store A/B 双存储、AntV X6 关系图与本地语音识别接入构成。发言进入后，语义单元和图结构按操作序列更新；用户可在看板中浏览关系、回看来源、修订节点并导出会议内容。</w:t>
+        <w:t>系统提供四段工作流：会前导入 UTF-8 文本、Markdown 或文本 PDF，人工确认待决问题并保留文件与行号；会中由图节点投影决策卡，显示支持、反对、来源和证据缺口，只有人工审核可使结论成为已确认；会后行动台账记录负责人、期限、状态及变更历史，关会前提示未决问题和行动缺项；跨会复盘由人明确关联两个议题节点，展示旧决议、本次证据与未完成行动。纪要和本地快照可导出。</w:t>
       </w:r>
     </w:p>
     <w:p>
@@ -1121,7 +1147,7 @@
       </w:pPr>
       <w:r>
         <w:rPr>
-          <w:rFonts w:ascii="宋体" w:hAnsi="宋体" w:eastAsia="宋体"/>
+          <w:rFonts w:ascii="Arial Unicode MS" w:hAnsi="Arial Unicode MS" w:eastAsia="Arial Unicode MS" w:cs="Arial Unicode MS"/>
         </w:rPr>
         <w:t>（五）应用场景与效果评估</w:t>
       </w:r>
@@ -1133,9 +1159,9 @@
       </w:pPr>
       <w:r>
         <w:rPr>
-          <w:rFonts w:ascii="宋体" w:hAnsi="宋体" w:eastAsia="宋体"/>
+          <w:rFonts w:ascii="Arial Unicode MS" w:hAnsi="Arial Unicode MS" w:eastAsia="Arial Unicode MS" w:cs="Arial Unicode MS"/>
         </w:rPr>
-        <w:t>会脉适用于项目方案讨论、课程研讨、产品评审和团队复盘。会中可观察议题分支、观点支持与反对关系，定位尚未收敛的分歧；会后可沿结论回溯原始发言，并将行动项与结构化纪要用于跟进。</w:t>
+        <w:t>项目方案讨论与任务会是首要应用场景。主持人先确认需要决定的问题，发言进入图谱后追溯原话并审核结论，再将行动分配给负责人；下次会议回顾旧决议与未完成事项。AI 提供带来源的候选，不替代主持人拍板。</w:t>
       </w:r>
     </w:p>
     <w:p>
@@ -1145,9 +1171,9 @@
       </w:pPr>
       <w:r>
         <w:rPr>
-          <w:rFonts w:ascii="宋体" w:hAnsi="宋体" w:eastAsia="宋体"/>
+          <w:rFonts w:ascii="Arial Unicode MS" w:hAnsi="Arial Unicode MS" w:eastAsia="Arial Unicode MS" w:cs="Arial Unicode MS"/>
         </w:rPr>
-        <w:t>效果评估围绕会议语义与图谱质量展开：以人工标注发言为参照，分别考察议题归属、观点抽取、证据关联、重复归并、冲突识别与来源回溯；同时分段记录识别、分析、图同步与界面响应耗时。评测记录保留样本范围、标注规范、模型配置和错误类型，便于复核与持续优化。</w:t>
+        <w:t>2026 年 10 月 10 日对辩论类 200 句运行真实 deepseek-chat 双智能体管线，197 句成功提交。仅对其中 41 条已标注候选评分：类型正确 22/41（53.7%），冲突关系召回 1/7，重复正对识别 0/3，目标归属正确 2/10。Mock 与真实结果分开记录。开篇立场被旧金标标为“结论”与产品定义存在冲突；目标关系仍需第二人复核。这些结果不支持“准确率达标”的宣称，也不能外推到方案评审或任务会。</w:t>
       </w:r>
     </w:p>
     <w:p>
@@ -1158,7 +1184,7 @@
       </w:pPr>
       <w:r>
         <w:rPr>
-          <w:rFonts w:ascii="宋体" w:hAnsi="宋体" w:eastAsia="宋体"/>
+          <w:rFonts w:ascii="Arial Unicode MS" w:hAnsi="Arial Unicode MS" w:eastAsia="Arial Unicode MS" w:cs="Arial Unicode MS"/>
         </w:rPr>
         <w:t>（六）数据安全与部署方式</w:t>
       </w:r>
@@ -1170,9 +1196,96 @@
       </w:pPr>
       <w:r>
         <w:rPr>
-          <w:rFonts w:ascii="宋体" w:hAnsi="宋体" w:eastAsia="宋体"/>
+          <w:rFonts w:ascii="Arial Unicode MS" w:hAnsi="Arial Unicode MS" w:eastAsia="Arial Unicode MS" w:cs="Arial Unicode MS"/>
         </w:rPr>
-        <w:t>系统采用本机优先的数据处理方式：音频由本机 ASR 处理，原始发言与关系图存储在本地；模型服务可按部署环境配置。会议数据通过来源引用、人工修订与图谱状态管理保持可追溯性，适合对资料保管和内容复核有要求的会议场景。</w:t>
+        <w:t>系统默认绑定 127.0.0.1，原始发言、图谱、材料摘录和行动历史保存在本机。轻量文字演示无需下载语音模型；完整语音模式使用本机 ASR。启用外部真实 LLM 时，会议文本会发送给配置的模型服务。公开演示应使用隔离样例，不应上传未经授权的真实会议资料。现有只读快照链接只在同一服务内有效，不具备正式身份验证和撤销能力。</w:t>
+      </w:r>
+    </w:p>
+    <w:p>
+      <w:pPr>
+        <w:pStyle w:val="Heading1"/>
+      </w:pPr>
+      <w:r>
+        <w:rPr>
+          <w:rFonts w:ascii="Arial Unicode MS" w:hAnsi="Arial Unicode MS" w:eastAsia="Arial Unicode MS" w:cs="Arial Unicode MS"/>
+        </w:rPr>
+        <w:t>三、开发测试与实测结果</w:t>
+      </w:r>
+    </w:p>
+    <w:p>
+      <w:pPr>
+        <w:pStyle w:val="Heading2"/>
+      </w:pPr>
+      <w:r>
+        <w:rPr>
+          <w:rFonts w:ascii="Arial Unicode MS" w:hAnsi="Arial Unicode MS" w:eastAsia="Arial Unicode MS" w:cs="Arial Unicode MS"/>
+        </w:rPr>
+        <w:t>（一）功能与可靠性验证</w:t>
+      </w:r>
+    </w:p>
+    <w:p>
+      <w:r>
+        <w:rPr>
+          <w:rFonts w:ascii="Arial Unicode MS" w:hAnsi="Arial Unicode MS" w:eastAsia="Arial Unicode MS" w:cs="Arial Unicode MS"/>
+        </w:rPr>
+        <w:t>截至 2026 年 10 月 11 日，后端 166 项单元与接口测试通过，前端 115 项测试通过，前端构建通过。轻量文字模式的本机启动烟测中，API、历史页和工作台均返回 HTTP 200。测试覆盖人工确认边界、行动版本冲突、会前材料引用、跨会显式关联和快照导出；这些自动化结果不能替代真实麦克风、长时会议或干净设备安装验收。</w:t>
+      </w:r>
+    </w:p>
+    <w:p>
+      <w:pPr>
+        <w:pStyle w:val="Heading2"/>
+      </w:pPr>
+      <w:r>
+        <w:rPr>
+          <w:rFonts w:ascii="Arial Unicode MS" w:hAnsi="Arial Unicode MS" w:eastAsia="Arial Unicode MS" w:cs="Arial Unicode MS"/>
+        </w:rPr>
+        <w:t>（二）模型质量与数据限制</w:t>
+      </w:r>
+    </w:p>
+    <w:p>
+      <w:r>
+        <w:rPr>
+          <w:rFonts w:ascii="Arial Unicode MS" w:hAnsi="Arial Unicode MS" w:eastAsia="Arial Unicode MS" w:cs="Arial Unicode MS"/>
+        </w:rPr>
+        <w:t>真实模型评测使用辩论 200 句和少量人工标注目标，类型正确率为 53.7%（22/41），冲突召回为 14.3%（1/7），重复 pairwise F1 为 0。关系目标仅 10 条可评分。原始预测、运行日志、错误切片和评分 JSON 随仓库保存；运行清单为事后重建，不能证明当时完整原始模型响应。方案会与任务会的 200 句标注队列尚未由人工填写，盲测、双人仲裁和跨场景稳定性仍待完成。</w:t>
+      </w:r>
+    </w:p>
+    <w:p>
+      <w:pPr>
+        <w:pStyle w:val="Heading1"/>
+      </w:pPr>
+      <w:r>
+        <w:rPr>
+          <w:rFonts w:ascii="Arial Unicode MS" w:hAnsi="Arial Unicode MS" w:eastAsia="Arial Unicode MS" w:cs="Arial Unicode MS"/>
+        </w:rPr>
+        <w:t>四、本机部署与演示</w:t>
+      </w:r>
+    </w:p>
+    <w:p>
+      <w:r>
+        <w:rPr>
+          <w:rFonts w:ascii="Arial Unicode MS" w:hAnsi="Arial Unicode MS" w:eastAsia="Arial Unicode MS" w:cs="Arial Unicode MS"/>
+        </w:rPr>
+        <w:t>在 macOS 安装 Python 3.12、Node.js/npm 后，先按 README 安装后端依赖并在 frontend 运行 npm ci。在仓库根目录执行 AMO_SKIP_ASR=1 bash scripts/start_local.sh，可打开 http://127.0.0.1:5173/ 进行文字演示。完整语音模式需另装本机 ASR、ffmpeg 与模型权重，再执行 bash scripts/start_local.sh。建议演示顺序为：建会与议程→确认会前问题→输入支持及反对发言→打开来源并人工确认决议→登记行动→结束并导出→第二场会议手动关联旧议题。</w:t>
+      </w:r>
+    </w:p>
+    <w:p>
+      <w:pPr>
+        <w:pStyle w:val="Heading1"/>
+      </w:pPr>
+      <w:r>
+        <w:rPr>
+          <w:rFonts w:ascii="Arial Unicode MS" w:hAnsi="Arial Unicode MS" w:eastAsia="Arial Unicode MS" w:cs="Arial Unicode MS"/>
+        </w:rPr>
+        <w:t>五、应用价值、局限与后续计划</w:t>
+      </w:r>
+    </w:p>
+    <w:p>
+      <w:r>
+        <w:rPr>
+          <w:rFonts w:ascii="Arial Unicode MS" w:hAnsi="Arial Unicode MS" w:eastAsia="Arial Unicode MS" w:cs="Arial Unicode MS"/>
+        </w:rPr>
+        <w:t>产品价值在于把“会议说了什么”延伸为“为何这样决定、谁在执行、下次是否改变”，同时保留原话与人工改动轨迹。现阶段主要限制是关系、冲突和重复识别质量偏低；真实 ASR 到真实 LLM 的现场全链路、双人标注、至少两场真实试用及五名新用户可用性测试尚未完成。下一阶段先统一标注口径并冻结盲测集，再针对候选召回、关系目标选择与证据对齐逐项实验；每次变更同时报告收益、延迟和失败样本。</w:t>
       </w:r>
     </w:p>
     <w:p>
@@ -1183,12 +1296,12 @@
       </w:pPr>
       <w:r>
         <w:rPr>
-          <w:rFonts w:ascii="宋体" w:hAnsi="宋体" w:eastAsia="宋体"/>
+          <w:rFonts w:ascii="Arial Unicode MS" w:hAnsi="Arial Unicode MS" w:eastAsia="Arial Unicode MS" w:cs="Arial Unicode MS"/>
           <w:b/>
           <w:color w:val="000000"/>
           <w:sz w:val="32"/>
         </w:rPr>
-        <w:t>三、附录</w:t>
+        <w:t>六、附录</w:t>
       </w:r>
     </w:p>
     <w:p>
@@ -1199,7 +1312,7 @@
       </w:pPr>
       <w:r>
         <w:rPr>
-          <w:rFonts w:ascii="宋体" w:hAnsi="宋体" w:eastAsia="宋体"/>
+          <w:rFonts w:ascii="Arial Unicode MS" w:hAnsi="Arial Unicode MS" w:eastAsia="Arial Unicode MS" w:cs="Arial Unicode MS"/>
           <w:b/>
           <w:color w:val="000000"/>
           <w:sz w:val="28"/>
@@ -1245,7 +1358,7 @@
             </w:pPr>
             <w:r>
               <w:rPr>
-                <w:rFonts w:ascii="宋体" w:hAnsi="宋体" w:eastAsia="宋体"/>
+                <w:rFonts w:ascii="Arial Unicode MS" w:hAnsi="Arial Unicode MS" w:eastAsia="Arial Unicode MS" w:cs="Arial Unicode MS"/>
                 <w:b/>
                 <w:color w:val="000000"/>
                 <w:sz w:val="21"/>
@@ -1272,7 +1385,7 @@
             </w:pPr>
             <w:r>
               <w:rPr>
-                <w:rFonts w:ascii="宋体" w:hAnsi="宋体" w:eastAsia="宋体"/>
+                <w:rFonts w:ascii="Arial Unicode MS" w:hAnsi="Arial Unicode MS" w:eastAsia="Arial Unicode MS" w:cs="Arial Unicode MS"/>
                 <w:b/>
                 <w:color w:val="000000"/>
                 <w:sz w:val="21"/>
@@ -1300,7 +1413,7 @@
             </w:pPr>
             <w:r>
               <w:rPr>
-                <w:rFonts w:ascii="宋体" w:hAnsi="宋体" w:eastAsia="宋体"/>
+                <w:rFonts w:ascii="Arial Unicode MS" w:hAnsi="Arial Unicode MS" w:eastAsia="Arial Unicode MS" w:cs="Arial Unicode MS"/>
                 <w:color w:val="000000"/>
                 <w:sz w:val="20"/>
               </w:rPr>
@@ -1325,7 +1438,7 @@
             </w:pPr>
             <w:r>
               <w:rPr>
-                <w:rFonts w:ascii="宋体" w:hAnsi="宋体" w:eastAsia="宋体"/>
+                <w:rFonts w:ascii="Arial Unicode MS" w:hAnsi="Arial Unicode MS" w:eastAsia="Arial Unicode MS" w:cs="Arial Unicode MS"/>
                 <w:color w:val="000000"/>
                 <w:sz w:val="20"/>
               </w:rPr>
@@ -1352,7 +1465,7 @@
             </w:pPr>
             <w:r>
               <w:rPr>
-                <w:rFonts w:ascii="宋体" w:hAnsi="宋体" w:eastAsia="宋体"/>
+                <w:rFonts w:ascii="Arial Unicode MS" w:hAnsi="Arial Unicode MS" w:eastAsia="Arial Unicode MS" w:cs="Arial Unicode MS"/>
                 <w:color w:val="000000"/>
                 <w:sz w:val="20"/>
               </w:rPr>
@@ -1377,7 +1490,7 @@
             </w:pPr>
             <w:r>
               <w:rPr>
-                <w:rFonts w:ascii="宋体" w:hAnsi="宋体" w:eastAsia="宋体"/>
+                <w:rFonts w:ascii="Arial Unicode MS" w:hAnsi="Arial Unicode MS" w:eastAsia="Arial Unicode MS" w:cs="Arial Unicode MS"/>
                 <w:color w:val="000000"/>
                 <w:sz w:val="20"/>
               </w:rPr>
@@ -1404,7 +1517,7 @@
             </w:pPr>
             <w:r>
               <w:rPr>
-                <w:rFonts w:ascii="宋体" w:hAnsi="宋体" w:eastAsia="宋体"/>
+                <w:rFonts w:ascii="Arial Unicode MS" w:hAnsi="Arial Unicode MS" w:eastAsia="Arial Unicode MS" w:cs="Arial Unicode MS"/>
                 <w:color w:val="000000"/>
                 <w:sz w:val="20"/>
               </w:rPr>
@@ -1430,7 +1543,7 @@
             </w:pPr>
             <w:r>
               <w:rPr>
-                <w:rFonts w:ascii="宋体" w:hAnsi="宋体" w:eastAsia="宋体"/>
+                <w:rFonts w:ascii="Arial Unicode MS" w:hAnsi="Arial Unicode MS" w:eastAsia="Arial Unicode MS" w:cs="Arial Unicode MS"/>
                 <w:color w:val="000000"/>
                 <w:sz w:val="20"/>
               </w:rPr>
@@ -1457,7 +1570,7 @@
             </w:pPr>
             <w:r>
               <w:rPr>
-                <w:rFonts w:ascii="宋体" w:hAnsi="宋体" w:eastAsia="宋体"/>
+                <w:rFonts w:ascii="Arial Unicode MS" w:hAnsi="Arial Unicode MS" w:eastAsia="Arial Unicode MS" w:cs="Arial Unicode MS"/>
                 <w:color w:val="000000"/>
                 <w:sz w:val="20"/>
               </w:rPr>
@@ -1482,7 +1595,7 @@
             </w:pPr>
             <w:r>
               <w:rPr>
-                <w:rFonts w:ascii="宋体" w:hAnsi="宋体" w:eastAsia="宋体"/>
+                <w:rFonts w:ascii="Arial Unicode MS" w:hAnsi="Arial Unicode MS" w:eastAsia="Arial Unicode MS" w:cs="Arial Unicode MS"/>
                 <w:color w:val="000000"/>
                 <w:sz w:val="20"/>
               </w:rPr>
@@ -1509,7 +1622,7 @@
             </w:pPr>
             <w:r>
               <w:rPr>
-                <w:rFonts w:ascii="宋体" w:hAnsi="宋体" w:eastAsia="宋体"/>
+                <w:rFonts w:ascii="Arial Unicode MS" w:hAnsi="Arial Unicode MS" w:eastAsia="Arial Unicode MS" w:cs="Arial Unicode MS"/>
                 <w:color w:val="000000"/>
                 <w:sz w:val="20"/>
               </w:rPr>
@@ -1534,7 +1647,7 @@
             </w:pPr>
             <w:r>
               <w:rPr>
-                <w:rFonts w:ascii="宋体" w:hAnsi="宋体" w:eastAsia="宋体"/>
+                <w:rFonts w:ascii="Arial Unicode MS" w:hAnsi="Arial Unicode MS" w:eastAsia="Arial Unicode MS" w:cs="Arial Unicode MS"/>
                 <w:color w:val="000000"/>
                 <w:sz w:val="20"/>
               </w:rPr>
@@ -2003,7 +2116,7 @@
       <w:spacing w:after="100" w:line="276" w:lineRule="auto"/>
     </w:pPr>
     <w:rPr>
-      <w:rFonts w:ascii="宋体" w:hAnsi="宋体" w:eastAsia="宋体" w:cs="宋体"/>
+      <w:rFonts w:ascii="Arial Unicode MS" w:hAnsi="Arial Unicode MS" w:eastAsia="Arial Unicode MS" w:cs="Arial Unicode MS"/>
       <w:sz w:val="24"/>
     </w:rPr>
   </w:style>
@@ -2066,7 +2179,7 @@
       <w:outlineLvl w:val="0"/>
     </w:pPr>
     <w:rPr>
-      <w:rFonts w:asciiTheme="majorHAnsi" w:eastAsiaTheme="majorEastAsia" w:hAnsiTheme="majorHAnsi" w:cstheme="majorBidi" w:ascii="宋体" w:hAnsi="宋体" w:eastAsia="宋体" w:cs="宋体"/>
+      <w:rFonts w:ascii="Arial Unicode MS" w:hAnsi="Arial Unicode MS" w:eastAsia="Arial Unicode MS" w:cs="Arial Unicode MS"/>
       <w:b/>
       <w:bCs/>
       <w:color w:val="000000"/>
@@ -2090,7 +2203,7 @@
       <w:outlineLvl w:val="1"/>
     </w:pPr>
     <w:rPr>
-      <w:rFonts w:asciiTheme="majorHAnsi" w:eastAsiaTheme="majorEastAsia" w:hAnsiTheme="majorHAnsi" w:cstheme="majorBidi" w:ascii="宋体" w:hAnsi="宋体" w:eastAsia="宋体" w:cs="宋体"/>
+      <w:rFonts w:ascii="Arial Unicode MS" w:hAnsi="Arial Unicode MS" w:eastAsia="Arial Unicode MS" w:cs="Arial Unicode MS"/>
       <w:b/>
       <w:bCs/>
       <w:color w:val="000000"/>
@@ -2114,7 +2227,7 @@
       <w:outlineLvl w:val="2"/>
     </w:pPr>
     <w:rPr>
-      <w:rFonts w:asciiTheme="majorHAnsi" w:eastAsiaTheme="majorEastAsia" w:hAnsiTheme="majorHAnsi" w:cstheme="majorBidi" w:ascii="宋体" w:hAnsi="宋体" w:eastAsia="宋体" w:cs="宋体"/>
+      <w:rFonts w:ascii="Arial Unicode MS" w:hAnsi="Arial Unicode MS" w:eastAsia="Arial Unicode MS" w:cs="Arial Unicode MS"/>
       <w:b/>
       <w:bCs/>
       <w:color w:val="000000"/>
@@ -2356,7 +2469,7 @@
       <w:contextualSpacing/>
     </w:pPr>
     <w:rPr>
-      <w:rFonts w:asciiTheme="majorHAnsi" w:eastAsiaTheme="majorEastAsia" w:hAnsiTheme="majorHAnsi" w:cstheme="majorBidi" w:ascii="宋体" w:hAnsi="宋体" w:eastAsia="宋体" w:cs="宋体"/>
+      <w:rFonts w:ascii="Arial Unicode MS" w:hAnsi="Arial Unicode MS" w:eastAsia="Arial Unicode MS" w:cs="Arial Unicode MS"/>
       <w:color w:val="17365D" w:themeColor="text2" w:themeShade="BF"/>
       <w:spacing w:val="5"/>
       <w:kern w:val="28"/>

</xml_diff>